<commit_message>
Fix Build 024 release candidate layout and checklist integrity
</commit_message>
<xml_diff>
--- a/docs/guides/VCL2FMXConverter_v6_0_Navigator_Conversion_Contracts_Guide.docx
+++ b/docs/guides/VCL2FMXConverter_v6_0_Navigator_Conversion_Contracts_Guide.docx
@@ -165,7 +165,7 @@
               <w:rPr>
                 <w:sz w:val="20"/>
               </w:rPr>
-              <w:t>August 2, 2026</w:t>
+              <w:t>August 3, 2026</w:t>
             </w:r>
           </w:p>
         </w:tc>
@@ -2471,9 +2471,6 @@
     <w:p>
       <w:pPr>
         <w:pStyle w:val="CodeBlock"/>
-        <w:rPr>
-          <w:rFonts w:hint="eastAsia"/>
-        </w:rPr>
       </w:pPr>
       <w:r>
         <w:t>{</w:t>
@@ -2482,9 +2479,6 @@
     <w:p>
       <w:pPr>
         <w:pStyle w:val="CodeBlock"/>
-        <w:rPr>
-          <w:rFonts w:hint="eastAsia"/>
-        </w:rPr>
       </w:pPr>
       <w:r>
         <w:t xml:space="preserve">  "input_file": "contracts\\colors\\01_class_should_not_add_uiconsts.pas",</w:t>
@@ -2493,9 +2487,6 @@
     <w:p>
       <w:pPr>
         <w:pStyle w:val="CodeBlock"/>
-        <w:rPr>
-          <w:rFonts w:hint="eastAsia"/>
-        </w:rPr>
       </w:pPr>
       <w:r>
         <w:t xml:space="preserve">  "expected_status": "converted",</w:t>
@@ -2504,9 +2495,6 @@
     <w:p>
       <w:pPr>
         <w:pStyle w:val="CodeBlock"/>
-        <w:rPr>
-          <w:rFonts w:hint="eastAsia"/>
-        </w:rPr>
       </w:pPr>
       <w:r>
         <w:t xml:space="preserve">  "expected_output_patterns": ["unit ContractClassShouldNotAddUIConsts"],</w:t>
@@ -2515,9 +2503,6 @@
     <w:p>
       <w:pPr>
         <w:pStyle w:val="CodeBlock"/>
-        <w:rPr>
-          <w:rFonts w:hint="eastAsia"/>
-        </w:rPr>
       </w:pPr>
       <w:r>
         <w:t xml:space="preserve">  "forbidden_output_patterns": [</w:t>
@@ -2526,9 +2511,6 @@
     <w:p>
       <w:pPr>
         <w:pStyle w:val="CodeBlock"/>
-        <w:rPr>
-          <w:rFonts w:hint="eastAsia"/>
-        </w:rPr>
       </w:pPr>
       <w:r>
         <w:t xml:space="preserve">    "System\\.UIConsts",</w:t>
@@ -2537,9 +2519,6 @@
     <w:p>
       <w:pPr>
         <w:pStyle w:val="CodeBlock"/>
-        <w:rPr>
-          <w:rFonts w:hint="eastAsia"/>
-        </w:rPr>
       </w:pPr>
       <w:r>
         <w:t xml:space="preserve">    "System\\.UITypes"</w:t>
@@ -2548,9 +2527,6 @@
     <w:p>
       <w:pPr>
         <w:pStyle w:val="CodeBlock"/>
-        <w:rPr>
-          <w:rFonts w:hint="eastAsia"/>
-        </w:rPr>
       </w:pPr>
       <w:r>
         <w:t xml:space="preserve">  ],</w:t>
@@ -2559,9 +2535,6 @@
     <w:p>
       <w:pPr>
         <w:pStyle w:val="CodeBlock"/>
-        <w:rPr>
-          <w:rFonts w:hint="eastAsia"/>
-        </w:rPr>
       </w:pPr>
       <w:r>
         <w:t xml:space="preserve">  "expected_report_patterns": [],</w:t>
@@ -2570,9 +2543,6 @@
     <w:p>
       <w:pPr>
         <w:pStyle w:val="CodeBlock"/>
-        <w:rPr>
-          <w:rFonts w:hint="eastAsia"/>
-        </w:rPr>
       </w:pPr>
       <w:r>
         <w:t xml:space="preserve">  "forbidden_report_patterns": []</w:t>
@@ -2581,9 +2551,6 @@
     <w:p>
       <w:pPr>
         <w:pStyle w:val="CodeBlock"/>
-        <w:rPr>
-          <w:rFonts w:hint="eastAsia"/>
-        </w:rPr>
       </w:pPr>
       <w:r>
         <w:t>}</w:t>
@@ -2610,9 +2577,6 @@
     <w:p>
       <w:pPr>
         <w:pStyle w:val="CodeBlock"/>
-        <w:rPr>
-          <w:rFonts w:hint="eastAsia"/>
-        </w:rPr>
       </w:pPr>
       <w:r>
         <w:t>procedure TContractRealClaColorShouldAddUIConsts.Run;</w:t>
@@ -2621,9 +2585,6 @@
     <w:p>
       <w:pPr>
         <w:pStyle w:val="CodeBlock"/>
-        <w:rPr>
-          <w:rFonts w:hint="eastAsia"/>
-        </w:rPr>
       </w:pPr>
       <w:r>
         <w:t>var</w:t>
@@ -2632,9 +2593,6 @@
     <w:p>
       <w:pPr>
         <w:pStyle w:val="CodeBlock"/>
-        <w:rPr>
-          <w:rFonts w:hint="eastAsia"/>
-        </w:rPr>
       </w:pPr>
       <w:r>
         <w:t xml:space="preserve">  ColorValue: TAlphaColor;</w:t>
@@ -2643,9 +2601,6 @@
     <w:p>
       <w:pPr>
         <w:pStyle w:val="CodeBlock"/>
-        <w:rPr>
-          <w:rFonts w:hint="eastAsia"/>
-        </w:rPr>
       </w:pPr>
       <w:r>
         <w:t>begin</w:t>
@@ -2654,9 +2609,6 @@
     <w:p>
       <w:pPr>
         <w:pStyle w:val="CodeBlock"/>
-        <w:rPr>
-          <w:rFonts w:hint="eastAsia"/>
-        </w:rPr>
       </w:pPr>
       <w:r>
         <w:t xml:space="preserve">  ColorValue := claBlack;</w:t>
@@ -2665,9 +2617,6 @@
     <w:p>
       <w:pPr>
         <w:pStyle w:val="CodeBlock"/>
-        <w:rPr>
-          <w:rFonts w:hint="eastAsia"/>
-        </w:rPr>
       </w:pPr>
       <w:r>
         <w:t xml:space="preserve">  Writeln(Integer(ColorValue));</w:t>
@@ -2676,9 +2625,6 @@
     <w:p>
       <w:pPr>
         <w:pStyle w:val="CodeBlock"/>
-        <w:rPr>
-          <w:rFonts w:hint="eastAsia"/>
-        </w:rPr>
       </w:pPr>
       <w:r>
         <w:t>end;</w:t>
@@ -3702,9 +3648,6 @@
     <w:p>
       <w:pPr>
         <w:pStyle w:val="CodeBlock"/>
-        <w:rPr>
-          <w:rFonts w:hint="eastAsia"/>
-        </w:rPr>
       </w:pPr>
       <w:r>
         <w:t>Review the converter source together with the contracts folder.</w:t>
@@ -3713,9 +3656,6 @@
     <w:p>
       <w:pPr>
         <w:pStyle w:val="CodeBlock"/>
-        <w:rPr>
-          <w:rFonts w:hint="eastAsia"/>
-        </w:rPr>
       </w:pPr>
       <w:r>
         <w:t>Each contract is a fixture plus an .expected.json file describing required</w:t>
@@ -3724,9 +3664,6 @@
     <w:p>
       <w:pPr>
         <w:pStyle w:val="CodeBlock"/>
-        <w:rPr>
-          <w:rFonts w:hint="eastAsia"/>
-        </w:rPr>
       </w:pPr>
       <w:r>
         <w:t>output, forbidden output, report expectations, and uses-clause expectations.</w:t>
@@ -3735,9 +3672,6 @@
     <w:p>
       <w:pPr>
         <w:pStyle w:val="CodeBlock"/>
-        <w:rPr>
-          <w:rFonts w:hint="eastAsia"/>
-        </w:rPr>
       </w:pPr>
       <w:r>
         <w:t>If you find a bug, check whether a contract already covers it.</w:t>
@@ -3746,9 +3680,6 @@
     <w:p>
       <w:pPr>
         <w:pStyle w:val="CodeBlock"/>
-        <w:rPr>
-          <w:rFonts w:hint="eastAsia"/>
-        </w:rPr>
       </w:pPr>
       <w:r>
         <w:t>If a contract exists but would not fail, report that the contract is weak.</w:t>
@@ -3757,9 +3688,6 @@
     <w:p>
       <w:pPr>
         <w:pStyle w:val="CodeBlock"/>
-        <w:rPr>
-          <w:rFonts w:hint="eastAsia"/>
-        </w:rPr>
       </w:pPr>
       <w:r>
         <w:t>If no contract exists, propose a new contract fixture and expected JSON.</w:t>
@@ -4068,7 +3996,7 @@
         <w:t xml:space="preserve">Maintenance Update - </w:t>
       </w:r>
       <w:r>
-        <w:t>August 2, 2026</w:t>
+        <w:t>August 3, 2026</w:t>
       </w:r>
     </w:p>
     <w:p>

</xml_diff>